<commit_message>
improve velocity conversion accuracy
</commit_message>
<xml_diff>
--- a/docs/pseudo_readthedocs_velocity.docx
+++ b/docs/pseudo_readthedocs_velocity.docx
@@ -253,7 +253,6 @@
                 <w:lang w:val="en"/>
               </w:rPr>
             </w:pPr>
-            <w:proofErr w:type="spellStart"/>
             <w:r>
               <w:rPr>
                 <w:bCs/>
@@ -272,47 +271,32 @@
                 <w:color w:val="2E74B5" w:themeColor="accent5" w:themeShade="BF"/>
                 <w:lang w:val="en"/>
               </w:rPr>
-              <w:t>class</w:t>
-            </w:r>
-            <w:proofErr w:type="spellEnd"/>
-            <w:r>
-              <w:rPr>
-                <w:bCs/>
-                <w:i/>
+              <w:t xml:space="preserve">class </w:t>
+            </w:r>
+            <w:r>
+              <w:rPr>
+                <w:bCs/>
                 <w:iCs/>
+                <w:lang w:val="en"/>
+              </w:rPr>
+              <w:t>velocity.mps_to_fps</w:t>
+            </w:r>
+            <w:r>
+              <w:rPr>
+                <w:bCs/>
                 <w:color w:val="2E74B5" w:themeColor="accent5" w:themeShade="BF"/>
                 <w:lang w:val="en"/>
               </w:rPr>
-              <w:t xml:space="preserve"> </w:t>
-            </w:r>
-            <w:proofErr w:type="spellStart"/>
-            <w:r>
-              <w:rPr>
-                <w:bCs/>
-                <w:iCs/>
-                <w:lang w:val="en"/>
-              </w:rPr>
-              <w:t>velocity.mps_to_fps</w:t>
-            </w:r>
-            <w:proofErr w:type="spellEnd"/>
+              <w:t>(</w:t>
+            </w:r>
             <w:r>
               <w:rPr>
                 <w:bCs/>
                 <w:color w:val="2E74B5" w:themeColor="accent5" w:themeShade="BF"/>
                 <w:lang w:val="en"/>
               </w:rPr>
-              <w:t>(</w:t>
-            </w:r>
-            <w:proofErr w:type="spellStart"/>
-            <w:r>
-              <w:rPr>
-                <w:bCs/>
-                <w:color w:val="2E74B5" w:themeColor="accent5" w:themeShade="BF"/>
-                <w:lang w:val="en"/>
-              </w:rPr>
               <w:t>velocity_mps</w:t>
             </w:r>
-            <w:proofErr w:type="spellEnd"/>
             <w:r>
               <w:rPr>
                 <w:bCs/>
@@ -406,7 +390,6 @@
                 <w:numId w:val="4"/>
               </w:numPr>
             </w:pPr>
-            <w:proofErr w:type="spellStart"/>
             <w:r>
               <w:rPr>
                 <w:b/>
@@ -414,7 +397,6 @@
               </w:rPr>
               <w:t>velocity_mps</w:t>
             </w:r>
-            <w:proofErr w:type="spellEnd"/>
             <w:r>
               <w:t xml:space="preserve"> – </w:t>
             </w:r>
@@ -436,16 +418,11 @@
             <w:r>
               <w:t xml:space="preserve">. No default </w:t>
             </w:r>
-            <w:proofErr w:type="gramStart"/>
             <w:r>
               <w:t>valu</w:t>
             </w:r>
             <w:r>
-              <w:t>e</w:t>
-            </w:r>
-            <w:proofErr w:type="gramEnd"/>
-            <w:r>
-              <w:t>.</w:t>
+              <w:t>e.</w:t>
             </w:r>
           </w:p>
         </w:tc>
@@ -490,7 +467,6 @@
                 <w:lang w:val="en"/>
               </w:rPr>
             </w:pPr>
-            <w:proofErr w:type="spellStart"/>
             <w:r>
               <w:rPr>
                 <w:bCs/>
@@ -509,54 +485,31 @@
                 <w:color w:val="2E74B5" w:themeColor="accent5" w:themeShade="BF"/>
                 <w:lang w:val="en"/>
               </w:rPr>
-              <w:t>class</w:t>
-            </w:r>
-            <w:proofErr w:type="spellEnd"/>
-            <w:r>
-              <w:rPr>
-                <w:bCs/>
-                <w:i/>
+              <w:t xml:space="preserve">class </w:t>
+            </w:r>
+            <w:r>
+              <w:rPr>
+                <w:bCs/>
                 <w:iCs/>
+                <w:lang w:val="en"/>
+              </w:rPr>
+              <w:t>velocity.fps_to_mps</w:t>
+            </w:r>
+            <w:r>
+              <w:rPr>
+                <w:bCs/>
                 <w:color w:val="2E74B5" w:themeColor="accent5" w:themeShade="BF"/>
                 <w:lang w:val="en"/>
               </w:rPr>
-              <w:t xml:space="preserve"> </w:t>
-            </w:r>
-            <w:proofErr w:type="spellStart"/>
-            <w:r>
-              <w:rPr>
-                <w:bCs/>
-                <w:iCs/>
-                <w:lang w:val="en"/>
-              </w:rPr>
-              <w:t>velocity.fps_to_mps</w:t>
-            </w:r>
-            <w:proofErr w:type="spellEnd"/>
+              <w:t>(</w:t>
+            </w:r>
             <w:r>
               <w:rPr>
                 <w:bCs/>
                 <w:color w:val="2E74B5" w:themeColor="accent5" w:themeShade="BF"/>
                 <w:lang w:val="en"/>
               </w:rPr>
-              <w:t>(</w:t>
-            </w:r>
-            <w:proofErr w:type="spellStart"/>
-            <w:r>
-              <w:rPr>
-                <w:bCs/>
-                <w:color w:val="2E74B5" w:themeColor="accent5" w:themeShade="BF"/>
-                <w:lang w:val="en"/>
-              </w:rPr>
-              <w:t>velocity_fps</w:t>
-            </w:r>
-            <w:proofErr w:type="spellEnd"/>
-            <w:r>
-              <w:rPr>
-                <w:bCs/>
-                <w:color w:val="2E74B5" w:themeColor="accent5" w:themeShade="BF"/>
-                <w:lang w:val="en"/>
-              </w:rPr>
-              <w:t>)</w:t>
+              <w:t>velocity_fps)</w:t>
             </w:r>
             <w:r>
               <w:rPr>
@@ -643,7 +596,6 @@
                 <w:numId w:val="4"/>
               </w:numPr>
             </w:pPr>
-            <w:proofErr w:type="spellStart"/>
             <w:r>
               <w:rPr>
                 <w:b/>
@@ -651,20 +603,11 @@
               </w:rPr>
               <w:t>velocity_fps</w:t>
             </w:r>
-            <w:proofErr w:type="spellEnd"/>
             <w:r>
               <w:t xml:space="preserve"> – </w:t>
             </w:r>
             <w:r>
-              <w:t xml:space="preserve">The velocity in feet-per-second. Can be any numeric value. No default </w:t>
-            </w:r>
-            <w:proofErr w:type="gramStart"/>
-            <w:r>
-              <w:t>value</w:t>
-            </w:r>
-            <w:proofErr w:type="gramEnd"/>
-            <w:r>
-              <w:t>.</w:t>
+              <w:t>The velocity in feet-per-second. Can be any numeric value. No default value.</w:t>
             </w:r>
           </w:p>
         </w:tc>
@@ -709,7 +652,6 @@
                 <w:lang w:val="en"/>
               </w:rPr>
             </w:pPr>
-            <w:proofErr w:type="spellStart"/>
             <w:r>
               <w:rPr>
                 <w:bCs/>
@@ -728,64 +670,31 @@
                 <w:color w:val="2E74B5" w:themeColor="accent5" w:themeShade="BF"/>
                 <w:lang w:val="en"/>
               </w:rPr>
-              <w:t>class</w:t>
-            </w:r>
-            <w:proofErr w:type="spellEnd"/>
-            <w:r>
-              <w:rPr>
-                <w:bCs/>
-                <w:i/>
+              <w:t xml:space="preserve">class </w:t>
+            </w:r>
+            <w:r>
+              <w:rPr>
+                <w:bCs/>
                 <w:iCs/>
+                <w:lang w:val="en"/>
+              </w:rPr>
+              <w:t>velocity.kmph_to_mph</w:t>
+            </w:r>
+            <w:r>
+              <w:rPr>
+                <w:bCs/>
                 <w:color w:val="2E74B5" w:themeColor="accent5" w:themeShade="BF"/>
                 <w:lang w:val="en"/>
               </w:rPr>
-              <w:t xml:space="preserve"> </w:t>
-            </w:r>
-            <w:proofErr w:type="spellStart"/>
-            <w:proofErr w:type="gramStart"/>
-            <w:r>
-              <w:rPr>
-                <w:bCs/>
-                <w:iCs/>
-                <w:lang w:val="en"/>
-              </w:rPr>
-              <w:t>velocity.kmph</w:t>
-            </w:r>
-            <w:proofErr w:type="gramEnd"/>
-            <w:r>
-              <w:rPr>
-                <w:bCs/>
-                <w:iCs/>
-                <w:lang w:val="en"/>
-              </w:rPr>
-              <w:t>_to_mph</w:t>
-            </w:r>
-            <w:proofErr w:type="spellEnd"/>
+              <w:t>(</w:t>
+            </w:r>
             <w:r>
               <w:rPr>
                 <w:bCs/>
                 <w:color w:val="2E74B5" w:themeColor="accent5" w:themeShade="BF"/>
                 <w:lang w:val="en"/>
               </w:rPr>
-              <w:t>(</w:t>
-            </w:r>
-            <w:proofErr w:type="spellStart"/>
-            <w:r>
-              <w:rPr>
-                <w:bCs/>
-                <w:color w:val="2E74B5" w:themeColor="accent5" w:themeShade="BF"/>
-                <w:lang w:val="en"/>
-              </w:rPr>
-              <w:t>velocity_kmph</w:t>
-            </w:r>
-            <w:proofErr w:type="spellEnd"/>
-            <w:r>
-              <w:rPr>
-                <w:bCs/>
-                <w:color w:val="2E74B5" w:themeColor="accent5" w:themeShade="BF"/>
-                <w:lang w:val="en"/>
-              </w:rPr>
-              <w:t>)</w:t>
+              <w:t>velocity_kmph)</w:t>
             </w:r>
             <w:r>
               <w:rPr>
@@ -872,7 +781,6 @@
                 <w:numId w:val="4"/>
               </w:numPr>
             </w:pPr>
-            <w:proofErr w:type="spellStart"/>
             <w:r>
               <w:rPr>
                 <w:b/>
@@ -880,7 +788,6 @@
               </w:rPr>
               <w:t>velocity_kmph</w:t>
             </w:r>
-            <w:proofErr w:type="spellEnd"/>
             <w:r>
               <w:t xml:space="preserve"> – </w:t>
             </w:r>
@@ -897,15 +804,7 @@
               <w:t>hour</w:t>
             </w:r>
             <w:r>
-              <w:t xml:space="preserve">. Can be any numeric value. No default </w:t>
-            </w:r>
-            <w:proofErr w:type="gramStart"/>
-            <w:r>
-              <w:t>value</w:t>
-            </w:r>
-            <w:proofErr w:type="gramEnd"/>
-            <w:r>
-              <w:t>.</w:t>
+              <w:t>. Can be any numeric value. No default value.</w:t>
             </w:r>
           </w:p>
         </w:tc>
@@ -950,7 +849,6 @@
                 <w:lang w:val="en"/>
               </w:rPr>
             </w:pPr>
-            <w:proofErr w:type="spellStart"/>
             <w:r>
               <w:rPr>
                 <w:bCs/>
@@ -969,54 +867,31 @@
                 <w:color w:val="2E74B5" w:themeColor="accent5" w:themeShade="BF"/>
                 <w:lang w:val="en"/>
               </w:rPr>
-              <w:t>class</w:t>
-            </w:r>
-            <w:proofErr w:type="spellEnd"/>
-            <w:r>
-              <w:rPr>
-                <w:bCs/>
-                <w:i/>
+              <w:t xml:space="preserve">class </w:t>
+            </w:r>
+            <w:r>
+              <w:rPr>
+                <w:bCs/>
                 <w:iCs/>
+                <w:lang w:val="en"/>
+              </w:rPr>
+              <w:t>velocity.mph_to_kmph</w:t>
+            </w:r>
+            <w:r>
+              <w:rPr>
+                <w:bCs/>
                 <w:color w:val="2E74B5" w:themeColor="accent5" w:themeShade="BF"/>
                 <w:lang w:val="en"/>
               </w:rPr>
-              <w:t xml:space="preserve"> </w:t>
-            </w:r>
-            <w:proofErr w:type="spellStart"/>
-            <w:r>
-              <w:rPr>
-                <w:bCs/>
-                <w:iCs/>
-                <w:lang w:val="en"/>
-              </w:rPr>
-              <w:t>velocity.mph_to_kmph</w:t>
-            </w:r>
-            <w:proofErr w:type="spellEnd"/>
+              <w:t>(</w:t>
+            </w:r>
             <w:r>
               <w:rPr>
                 <w:bCs/>
                 <w:color w:val="2E74B5" w:themeColor="accent5" w:themeShade="BF"/>
                 <w:lang w:val="en"/>
               </w:rPr>
-              <w:t>(</w:t>
-            </w:r>
-            <w:proofErr w:type="spellStart"/>
-            <w:r>
-              <w:rPr>
-                <w:bCs/>
-                <w:color w:val="2E74B5" w:themeColor="accent5" w:themeShade="BF"/>
-                <w:lang w:val="en"/>
-              </w:rPr>
-              <w:t>velocity_mph</w:t>
-            </w:r>
-            <w:proofErr w:type="spellEnd"/>
-            <w:r>
-              <w:rPr>
-                <w:bCs/>
-                <w:color w:val="2E74B5" w:themeColor="accent5" w:themeShade="BF"/>
-                <w:lang w:val="en"/>
-              </w:rPr>
-              <w:t>)</w:t>
+              <w:t>velocity_mph)</w:t>
             </w:r>
             <w:r>
               <w:rPr>
@@ -1103,7 +978,6 @@
                 <w:numId w:val="4"/>
               </w:numPr>
             </w:pPr>
-            <w:proofErr w:type="spellStart"/>
             <w:r>
               <w:rPr>
                 <w:b/>
@@ -1111,20 +985,11 @@
               </w:rPr>
               <w:t>velocity_mph</w:t>
             </w:r>
-            <w:proofErr w:type="spellEnd"/>
             <w:r>
               <w:t xml:space="preserve"> – </w:t>
             </w:r>
             <w:r>
-              <w:t xml:space="preserve">The velocity in miles-per-hour. Can be any numeric value. No default </w:t>
-            </w:r>
-            <w:proofErr w:type="gramStart"/>
-            <w:r>
-              <w:t>value</w:t>
-            </w:r>
-            <w:proofErr w:type="gramEnd"/>
-            <w:r>
-              <w:t>.</w:t>
+              <w:t>The velocity in miles-per-hour. Can be any numeric value. No default value.</w:t>
             </w:r>
           </w:p>
         </w:tc>
@@ -1169,7 +1034,6 @@
                 <w:lang w:val="en"/>
               </w:rPr>
             </w:pPr>
-            <w:proofErr w:type="spellStart"/>
             <w:r>
               <w:rPr>
                 <w:bCs/>
@@ -1188,64 +1052,31 @@
                 <w:color w:val="2E74B5" w:themeColor="accent5" w:themeShade="BF"/>
                 <w:lang w:val="en"/>
               </w:rPr>
-              <w:t>class</w:t>
-            </w:r>
-            <w:proofErr w:type="spellEnd"/>
-            <w:r>
-              <w:rPr>
-                <w:bCs/>
-                <w:i/>
+              <w:t xml:space="preserve">class </w:t>
+            </w:r>
+            <w:r>
+              <w:rPr>
+                <w:bCs/>
                 <w:iCs/>
+                <w:lang w:val="en"/>
+              </w:rPr>
+              <w:t>velocity.knots_to_kmph</w:t>
+            </w:r>
+            <w:r>
+              <w:rPr>
+                <w:bCs/>
                 <w:color w:val="2E74B5" w:themeColor="accent5" w:themeShade="BF"/>
                 <w:lang w:val="en"/>
               </w:rPr>
-              <w:t xml:space="preserve"> </w:t>
-            </w:r>
-            <w:proofErr w:type="spellStart"/>
-            <w:proofErr w:type="gramStart"/>
-            <w:r>
-              <w:rPr>
-                <w:bCs/>
-                <w:iCs/>
-                <w:lang w:val="en"/>
-              </w:rPr>
-              <w:t>velocity.knots</w:t>
-            </w:r>
-            <w:proofErr w:type="gramEnd"/>
-            <w:r>
-              <w:rPr>
-                <w:bCs/>
-                <w:iCs/>
-                <w:lang w:val="en"/>
-              </w:rPr>
-              <w:t>_to_kmph</w:t>
-            </w:r>
-            <w:proofErr w:type="spellEnd"/>
+              <w:t>(</w:t>
+            </w:r>
             <w:r>
               <w:rPr>
                 <w:bCs/>
                 <w:color w:val="2E74B5" w:themeColor="accent5" w:themeShade="BF"/>
                 <w:lang w:val="en"/>
               </w:rPr>
-              <w:t>(</w:t>
-            </w:r>
-            <w:proofErr w:type="spellStart"/>
-            <w:r>
-              <w:rPr>
-                <w:bCs/>
-                <w:color w:val="2E74B5" w:themeColor="accent5" w:themeShade="BF"/>
-                <w:lang w:val="en"/>
-              </w:rPr>
-              <w:t>velocity_knots</w:t>
-            </w:r>
-            <w:proofErr w:type="spellEnd"/>
-            <w:r>
-              <w:rPr>
-                <w:bCs/>
-                <w:color w:val="2E74B5" w:themeColor="accent5" w:themeShade="BF"/>
-                <w:lang w:val="en"/>
-              </w:rPr>
-              <w:t>)</w:t>
+              <w:t>velocity_knots)</w:t>
             </w:r>
             <w:r>
               <w:rPr>
@@ -1332,7 +1163,6 @@
                 <w:numId w:val="4"/>
               </w:numPr>
             </w:pPr>
-            <w:proofErr w:type="spellStart"/>
             <w:r>
               <w:rPr>
                 <w:b/>
@@ -1340,20 +1170,11 @@
               </w:rPr>
               <w:t>velocity_knots</w:t>
             </w:r>
-            <w:proofErr w:type="spellEnd"/>
             <w:r>
               <w:t xml:space="preserve"> – </w:t>
             </w:r>
             <w:r>
-              <w:t xml:space="preserve">The velocity in knots. Can be any numeric value. No default </w:t>
-            </w:r>
-            <w:proofErr w:type="gramStart"/>
-            <w:r>
-              <w:t>value</w:t>
-            </w:r>
-            <w:proofErr w:type="gramEnd"/>
-            <w:r>
-              <w:t>.</w:t>
+              <w:t>The velocity in knots. Can be any numeric value. No default value.</w:t>
             </w:r>
           </w:p>
         </w:tc>
@@ -1399,7 +1220,6 @@
                 <w:lang w:val="en"/>
               </w:rPr>
             </w:pPr>
-            <w:proofErr w:type="spellStart"/>
             <w:r>
               <w:rPr>
                 <w:bCs/>
@@ -1419,64 +1239,31 @@
                 <w:color w:val="2E74B5" w:themeColor="accent5" w:themeShade="BF"/>
                 <w:lang w:val="en"/>
               </w:rPr>
-              <w:t>class</w:t>
-            </w:r>
-            <w:proofErr w:type="spellEnd"/>
-            <w:r>
-              <w:rPr>
-                <w:bCs/>
-                <w:i/>
+              <w:t xml:space="preserve">class </w:t>
+            </w:r>
+            <w:r>
+              <w:rPr>
+                <w:bCs/>
                 <w:iCs/>
+                <w:lang w:val="en"/>
+              </w:rPr>
+              <w:t>velocity.kmph_to_knots</w:t>
+            </w:r>
+            <w:r>
+              <w:rPr>
+                <w:bCs/>
                 <w:color w:val="2E74B5" w:themeColor="accent5" w:themeShade="BF"/>
                 <w:lang w:val="en"/>
               </w:rPr>
-              <w:t xml:space="preserve"> </w:t>
-            </w:r>
-            <w:proofErr w:type="spellStart"/>
-            <w:proofErr w:type="gramStart"/>
-            <w:r>
-              <w:rPr>
-                <w:bCs/>
-                <w:iCs/>
-                <w:lang w:val="en"/>
-              </w:rPr>
-              <w:t>velocity.kmph</w:t>
-            </w:r>
-            <w:proofErr w:type="gramEnd"/>
-            <w:r>
-              <w:rPr>
-                <w:bCs/>
-                <w:iCs/>
-                <w:lang w:val="en"/>
-              </w:rPr>
-              <w:t>_to_knots</w:t>
-            </w:r>
-            <w:proofErr w:type="spellEnd"/>
+              <w:t>(</w:t>
+            </w:r>
             <w:r>
               <w:rPr>
                 <w:bCs/>
                 <w:color w:val="2E74B5" w:themeColor="accent5" w:themeShade="BF"/>
                 <w:lang w:val="en"/>
               </w:rPr>
-              <w:t>(</w:t>
-            </w:r>
-            <w:proofErr w:type="spellStart"/>
-            <w:r>
-              <w:rPr>
-                <w:bCs/>
-                <w:color w:val="2E74B5" w:themeColor="accent5" w:themeShade="BF"/>
-                <w:lang w:val="en"/>
-              </w:rPr>
-              <w:t>velocity_kmph</w:t>
-            </w:r>
-            <w:proofErr w:type="spellEnd"/>
-            <w:r>
-              <w:rPr>
-                <w:bCs/>
-                <w:color w:val="2E74B5" w:themeColor="accent5" w:themeShade="BF"/>
-                <w:lang w:val="en"/>
-              </w:rPr>
-              <w:t>)</w:t>
+              <w:t>velocity_kmph)</w:t>
             </w:r>
             <w:r>
               <w:rPr>
@@ -1500,21 +1287,7 @@
         <w:rPr>
           <w:lang w:val="en"/>
         </w:rPr>
-        <w:t xml:space="preserve">Conversion of kilometers-per-hour velocity to a </w:t>
-      </w:r>
-      <w:proofErr w:type="gramStart"/>
-      <w:r>
-        <w:rPr>
-          <w:lang w:val="en"/>
-        </w:rPr>
-        <w:t>knots</w:t>
-      </w:r>
-      <w:proofErr w:type="gramEnd"/>
-      <w:r>
-        <w:rPr>
-          <w:lang w:val="en"/>
-        </w:rPr>
-        <w:t xml:space="preserve"> velocity value. </w:t>
+        <w:t xml:space="preserve">Conversion of kilometers-per-hour velocity to a knots velocity value. </w:t>
       </w:r>
     </w:p>
     <w:tbl>
@@ -1577,7 +1350,6 @@
                 <w:numId w:val="4"/>
               </w:numPr>
             </w:pPr>
-            <w:proofErr w:type="spellStart"/>
             <w:r>
               <w:rPr>
                 <w:b/>
@@ -1585,20 +1357,11 @@
               </w:rPr>
               <w:t>velocity_kmph</w:t>
             </w:r>
-            <w:proofErr w:type="spellEnd"/>
             <w:r>
               <w:t xml:space="preserve"> – </w:t>
             </w:r>
             <w:r>
-              <w:t xml:space="preserve">The velocity in kilometers-per-hour. Can be any numeric value. No default </w:t>
-            </w:r>
-            <w:proofErr w:type="gramStart"/>
-            <w:r>
-              <w:t>value</w:t>
-            </w:r>
-            <w:proofErr w:type="gramEnd"/>
-            <w:r>
-              <w:t>.</w:t>
+              <w:t>The velocity in kilometers-per-hour. Can be any numeric value. No default value.</w:t>
             </w:r>
           </w:p>
         </w:tc>
@@ -1643,7 +1406,6 @@
                 <w:lang w:val="en"/>
               </w:rPr>
             </w:pPr>
-            <w:proofErr w:type="spellStart"/>
             <w:r>
               <w:rPr>
                 <w:bCs/>
@@ -1662,64 +1424,31 @@
                 <w:color w:val="2E74B5" w:themeColor="accent5" w:themeShade="BF"/>
                 <w:lang w:val="en"/>
               </w:rPr>
-              <w:t>class</w:t>
-            </w:r>
-            <w:proofErr w:type="spellEnd"/>
-            <w:r>
-              <w:rPr>
-                <w:bCs/>
-                <w:i/>
+              <w:t xml:space="preserve">class </w:t>
+            </w:r>
+            <w:r>
+              <w:rPr>
+                <w:bCs/>
                 <w:iCs/>
+                <w:lang w:val="en"/>
+              </w:rPr>
+              <w:t>velocity.knots_to_mph</w:t>
+            </w:r>
+            <w:r>
+              <w:rPr>
+                <w:bCs/>
                 <w:color w:val="2E74B5" w:themeColor="accent5" w:themeShade="BF"/>
                 <w:lang w:val="en"/>
               </w:rPr>
-              <w:t xml:space="preserve"> </w:t>
-            </w:r>
-            <w:proofErr w:type="spellStart"/>
-            <w:proofErr w:type="gramStart"/>
-            <w:r>
-              <w:rPr>
-                <w:bCs/>
-                <w:iCs/>
-                <w:lang w:val="en"/>
-              </w:rPr>
-              <w:t>velocity.knots</w:t>
-            </w:r>
-            <w:proofErr w:type="gramEnd"/>
-            <w:r>
-              <w:rPr>
-                <w:bCs/>
-                <w:iCs/>
-                <w:lang w:val="en"/>
-              </w:rPr>
-              <w:t>_to_mph</w:t>
-            </w:r>
-            <w:proofErr w:type="spellEnd"/>
+              <w:t>(</w:t>
+            </w:r>
             <w:r>
               <w:rPr>
                 <w:bCs/>
                 <w:color w:val="2E74B5" w:themeColor="accent5" w:themeShade="BF"/>
                 <w:lang w:val="en"/>
               </w:rPr>
-              <w:t>(</w:t>
-            </w:r>
-            <w:proofErr w:type="spellStart"/>
-            <w:r>
-              <w:rPr>
-                <w:bCs/>
-                <w:color w:val="2E74B5" w:themeColor="accent5" w:themeShade="BF"/>
-                <w:lang w:val="en"/>
-              </w:rPr>
-              <w:t>velocity_knots</w:t>
-            </w:r>
-            <w:proofErr w:type="spellEnd"/>
-            <w:r>
-              <w:rPr>
-                <w:bCs/>
-                <w:color w:val="2E74B5" w:themeColor="accent5" w:themeShade="BF"/>
-                <w:lang w:val="en"/>
-              </w:rPr>
-              <w:t>)</w:t>
+              <w:t>velocity_knots)</w:t>
             </w:r>
             <w:r>
               <w:rPr>
@@ -1806,7 +1535,6 @@
                 <w:numId w:val="4"/>
               </w:numPr>
             </w:pPr>
-            <w:proofErr w:type="spellStart"/>
             <w:r>
               <w:rPr>
                 <w:b/>
@@ -1814,20 +1542,11 @@
               </w:rPr>
               <w:t>velocity_knots</w:t>
             </w:r>
-            <w:proofErr w:type="spellEnd"/>
             <w:r>
               <w:t xml:space="preserve"> – </w:t>
             </w:r>
             <w:r>
-              <w:t xml:space="preserve">The velocity in knots. Can be any numeric value. No default </w:t>
-            </w:r>
-            <w:proofErr w:type="gramStart"/>
-            <w:r>
-              <w:t>value</w:t>
-            </w:r>
-            <w:proofErr w:type="gramEnd"/>
-            <w:r>
-              <w:t>.</w:t>
+              <w:t>The velocity in knots. Can be any numeric value. No default value.</w:t>
             </w:r>
           </w:p>
         </w:tc>
@@ -1873,7 +1592,6 @@
                 <w:lang w:val="en"/>
               </w:rPr>
             </w:pPr>
-            <w:proofErr w:type="spellStart"/>
             <w:r>
               <w:rPr>
                 <w:bCs/>
@@ -1892,54 +1610,31 @@
                 <w:color w:val="2E74B5" w:themeColor="accent5" w:themeShade="BF"/>
                 <w:lang w:val="en"/>
               </w:rPr>
-              <w:t>class</w:t>
-            </w:r>
-            <w:proofErr w:type="spellEnd"/>
-            <w:r>
-              <w:rPr>
-                <w:bCs/>
-                <w:i/>
+              <w:t xml:space="preserve">class </w:t>
+            </w:r>
+            <w:r>
+              <w:rPr>
+                <w:bCs/>
                 <w:iCs/>
+                <w:lang w:val="en"/>
+              </w:rPr>
+              <w:t>velocity.mph_to_knots</w:t>
+            </w:r>
+            <w:r>
+              <w:rPr>
+                <w:bCs/>
                 <w:color w:val="2E74B5" w:themeColor="accent5" w:themeShade="BF"/>
                 <w:lang w:val="en"/>
               </w:rPr>
-              <w:t xml:space="preserve"> </w:t>
-            </w:r>
-            <w:proofErr w:type="spellStart"/>
-            <w:r>
-              <w:rPr>
-                <w:bCs/>
-                <w:iCs/>
-                <w:lang w:val="en"/>
-              </w:rPr>
-              <w:t>velocity.mph_to_knots</w:t>
-            </w:r>
-            <w:proofErr w:type="spellEnd"/>
+              <w:t>(</w:t>
+            </w:r>
             <w:r>
               <w:rPr>
                 <w:bCs/>
                 <w:color w:val="2E74B5" w:themeColor="accent5" w:themeShade="BF"/>
                 <w:lang w:val="en"/>
               </w:rPr>
-              <w:t>(</w:t>
-            </w:r>
-            <w:proofErr w:type="spellStart"/>
-            <w:r>
-              <w:rPr>
-                <w:bCs/>
-                <w:color w:val="2E74B5" w:themeColor="accent5" w:themeShade="BF"/>
-                <w:lang w:val="en"/>
-              </w:rPr>
-              <w:t>velocity_mph</w:t>
-            </w:r>
-            <w:proofErr w:type="spellEnd"/>
-            <w:r>
-              <w:rPr>
-                <w:bCs/>
-                <w:color w:val="2E74B5" w:themeColor="accent5" w:themeShade="BF"/>
-                <w:lang w:val="en"/>
-              </w:rPr>
-              <w:t>)</w:t>
+              <w:t>velocity_mph)</w:t>
             </w:r>
             <w:r>
               <w:rPr>
@@ -1963,21 +1658,7 @@
         <w:rPr>
           <w:lang w:val="en"/>
         </w:rPr>
-        <w:t xml:space="preserve">Conversion of miles-per-hour velocity to a </w:t>
-      </w:r>
-      <w:proofErr w:type="gramStart"/>
-      <w:r>
-        <w:rPr>
-          <w:lang w:val="en"/>
-        </w:rPr>
-        <w:t>knots</w:t>
-      </w:r>
-      <w:proofErr w:type="gramEnd"/>
-      <w:r>
-        <w:rPr>
-          <w:lang w:val="en"/>
-        </w:rPr>
-        <w:t xml:space="preserve"> velocity value.</w:t>
+        <w:t>Conversion of miles-per-hour velocity to a knots velocity value.</w:t>
       </w:r>
     </w:p>
     <w:tbl>
@@ -2040,7 +1721,6 @@
                 <w:numId w:val="4"/>
               </w:numPr>
             </w:pPr>
-            <w:proofErr w:type="spellStart"/>
             <w:r>
               <w:rPr>
                 <w:b/>
@@ -2048,20 +1728,11 @@
               </w:rPr>
               <w:t>velocity_mph</w:t>
             </w:r>
-            <w:proofErr w:type="spellEnd"/>
             <w:r>
               <w:t xml:space="preserve"> – </w:t>
             </w:r>
             <w:r>
-              <w:t xml:space="preserve">The velocity in miles-per-hour. Can be any numeric value. No default </w:t>
-            </w:r>
-            <w:proofErr w:type="gramStart"/>
-            <w:r>
-              <w:t>value</w:t>
-            </w:r>
-            <w:proofErr w:type="gramEnd"/>
-            <w:r>
-              <w:t>.</w:t>
+              <w:t>The velocity in miles-per-hour. Can be any numeric value. No default value.</w:t>
             </w:r>
           </w:p>
         </w:tc>
@@ -2145,21 +1816,7 @@
               <w:rPr>
                 <w:szCs w:val="20"/>
               </w:rPr>
-              <w:t xml:space="preserve">&gt;&gt;&gt; from </w:t>
-            </w:r>
-            <w:proofErr w:type="spellStart"/>
-            <w:r>
-              <w:rPr>
-                <w:szCs w:val="20"/>
-              </w:rPr>
-              <w:t>cedargrove_unit_</w:t>
-            </w:r>
-            <w:proofErr w:type="gramStart"/>
-            <w:r>
-              <w:rPr>
-                <w:szCs w:val="20"/>
-              </w:rPr>
-              <w:t>converter.</w:t>
+              <w:t>&gt;&gt;&gt; from cedargrove_unit_converter.</w:t>
             </w:r>
             <w:r>
               <w:rPr>
@@ -2167,8 +1824,6 @@
               </w:rPr>
               <w:t>velocity</w:t>
             </w:r>
-            <w:proofErr w:type="spellEnd"/>
-            <w:proofErr w:type="gramEnd"/>
             <w:r>
               <w:rPr>
                 <w:szCs w:val="20"/>
@@ -2192,35 +1847,7 @@
               <w:rPr>
                 <w:szCs w:val="20"/>
               </w:rPr>
-              <w:t xml:space="preserve">&gt;&gt;&gt; </w:t>
-            </w:r>
-            <w:proofErr w:type="spellStart"/>
-            <w:r>
-              <w:rPr>
-                <w:szCs w:val="20"/>
-              </w:rPr>
-              <w:t>mps_to_</w:t>
-            </w:r>
-            <w:proofErr w:type="gramStart"/>
-            <w:r>
-              <w:rPr>
-                <w:szCs w:val="20"/>
-              </w:rPr>
-              <w:t>fps</w:t>
-            </w:r>
-            <w:proofErr w:type="spellEnd"/>
-            <w:r>
-              <w:rPr>
-                <w:szCs w:val="20"/>
-              </w:rPr>
-              <w:t>(</w:t>
-            </w:r>
-            <w:proofErr w:type="gramEnd"/>
-            <w:r>
-              <w:rPr>
-                <w:szCs w:val="20"/>
-              </w:rPr>
-              <w:t xml:space="preserve">100)       </w:t>
+              <w:t xml:space="preserve">&gt;&gt;&gt; mps_to_fps(100)       </w:t>
             </w:r>
             <w:r>
               <w:rPr>
@@ -2245,61 +1872,51 @@
               <w:rPr>
                 <w:szCs w:val="20"/>
               </w:rPr>
-              <w:t>328.1</w:t>
-            </w:r>
-          </w:p>
-          <w:p>
-            <w:pPr>
-              <w:rPr>
-                <w:szCs w:val="20"/>
-              </w:rPr>
-            </w:pPr>
-          </w:p>
-          <w:p>
-            <w:pPr>
-              <w:rPr>
-                <w:szCs w:val="20"/>
-              </w:rPr>
-            </w:pPr>
-            <w:r>
-              <w:rPr>
-                <w:szCs w:val="20"/>
-              </w:rPr>
-              <w:t xml:space="preserve">&gt;&gt;&gt; </w:t>
-            </w:r>
-            <w:proofErr w:type="spellStart"/>
-            <w:r>
-              <w:rPr>
-                <w:szCs w:val="20"/>
-              </w:rPr>
-              <w:t>fps_to_</w:t>
-            </w:r>
-            <w:proofErr w:type="gramStart"/>
-            <w:r>
-              <w:rPr>
-                <w:szCs w:val="20"/>
-              </w:rPr>
-              <w:t>mps</w:t>
-            </w:r>
-            <w:proofErr w:type="spellEnd"/>
-            <w:r>
-              <w:rPr>
-                <w:szCs w:val="20"/>
-              </w:rPr>
-              <w:t>(</w:t>
-            </w:r>
-            <w:proofErr w:type="gramEnd"/>
-            <w:r>
-              <w:rPr>
-                <w:szCs w:val="20"/>
-              </w:rPr>
-              <w:t xml:space="preserve">328.1)    </w:t>
-            </w:r>
-            <w:r>
-              <w:rPr>
-                <w:szCs w:val="20"/>
-              </w:rPr>
-              <w:t xml:space="preserve">     </w:t>
+              <w:t>328.</w:t>
+            </w:r>
+            <w:r>
+              <w:rPr>
+                <w:szCs w:val="20"/>
+              </w:rPr>
+              <w:t>084</w:t>
+            </w:r>
+          </w:p>
+          <w:p>
+            <w:pPr>
+              <w:rPr>
+                <w:szCs w:val="20"/>
+              </w:rPr>
+            </w:pPr>
+          </w:p>
+          <w:p>
+            <w:pPr>
+              <w:rPr>
+                <w:szCs w:val="20"/>
+              </w:rPr>
+            </w:pPr>
+            <w:r>
+              <w:rPr>
+                <w:szCs w:val="20"/>
+              </w:rPr>
+              <w:t>&gt;&gt;&gt; fps_to_mps(328.</w:t>
+            </w:r>
+            <w:r>
+              <w:rPr>
+                <w:szCs w:val="20"/>
+              </w:rPr>
+              <w:t>084</w:t>
+            </w:r>
+            <w:r>
+              <w:rPr>
+                <w:szCs w:val="20"/>
+              </w:rPr>
+              <w:t xml:space="preserve">)   </w:t>
+            </w:r>
+            <w:r>
+              <w:rPr>
+                <w:szCs w:val="20"/>
+              </w:rPr>
+              <w:t xml:space="preserve">  </w:t>
             </w:r>
             <w:r>
               <w:rPr>
@@ -2338,35 +1955,7 @@
               <w:rPr>
                 <w:szCs w:val="20"/>
               </w:rPr>
-              <w:t xml:space="preserve">&gt;&gt;&gt; </w:t>
-            </w:r>
-            <w:proofErr w:type="spellStart"/>
-            <w:r>
-              <w:rPr>
-                <w:szCs w:val="20"/>
-              </w:rPr>
-              <w:t>kmph_to_</w:t>
-            </w:r>
-            <w:proofErr w:type="gramStart"/>
-            <w:r>
-              <w:rPr>
-                <w:szCs w:val="20"/>
-              </w:rPr>
-              <w:t>mph</w:t>
-            </w:r>
-            <w:proofErr w:type="spellEnd"/>
-            <w:r>
-              <w:rPr>
-                <w:szCs w:val="20"/>
-              </w:rPr>
-              <w:t>(</w:t>
-            </w:r>
-            <w:proofErr w:type="gramEnd"/>
-            <w:r>
-              <w:rPr>
-                <w:szCs w:val="20"/>
-              </w:rPr>
-              <w:t xml:space="preserve">68)      </w:t>
+              <w:t xml:space="preserve">&gt;&gt;&gt; kmph_to_mph(68)      </w:t>
             </w:r>
             <w:r>
               <w:rPr>
@@ -2378,124 +1967,70 @@
               <w:rPr>
                 <w:szCs w:val="20"/>
               </w:rPr>
-              <w:t xml:space="preserve">  # Kilometers-</w:t>
-            </w:r>
-            <w:proofErr w:type="spellStart"/>
-            <w:r>
-              <w:rPr>
-                <w:szCs w:val="20"/>
-              </w:rPr>
-              <w:t>Per_Hour</w:t>
-            </w:r>
-            <w:proofErr w:type="spellEnd"/>
-            <w:r>
-              <w:rPr>
-                <w:szCs w:val="20"/>
-              </w:rPr>
-              <w:t xml:space="preserve"> to Miles-</w:t>
-            </w:r>
-            <w:proofErr w:type="spellStart"/>
-            <w:r>
-              <w:rPr>
-                <w:szCs w:val="20"/>
-              </w:rPr>
-              <w:t>Per_Hour</w:t>
-            </w:r>
-            <w:proofErr w:type="spellEnd"/>
-            <w:r>
-              <w:rPr>
-                <w:szCs w:val="20"/>
-              </w:rPr>
-              <w:t xml:space="preserve"> Converter</w:t>
-            </w:r>
-          </w:p>
-          <w:p>
-            <w:pPr>
-              <w:rPr>
-                <w:szCs w:val="20"/>
-              </w:rPr>
-            </w:pPr>
-            <w:r>
-              <w:rPr>
-                <w:szCs w:val="20"/>
-              </w:rPr>
-              <w:t>42.2552</w:t>
-            </w:r>
-          </w:p>
-          <w:p>
-            <w:pPr>
-              <w:rPr>
-                <w:szCs w:val="20"/>
-              </w:rPr>
-            </w:pPr>
-          </w:p>
-          <w:p>
-            <w:pPr>
-              <w:rPr>
-                <w:szCs w:val="20"/>
-              </w:rPr>
-            </w:pPr>
-            <w:r>
-              <w:rPr>
-                <w:szCs w:val="20"/>
-              </w:rPr>
-              <w:t xml:space="preserve">&gt;&gt;&gt; </w:t>
-            </w:r>
-            <w:proofErr w:type="spellStart"/>
-            <w:r>
-              <w:rPr>
-                <w:szCs w:val="20"/>
-              </w:rPr>
-              <w:t>mph_to_</w:t>
-            </w:r>
-            <w:proofErr w:type="gramStart"/>
-            <w:r>
-              <w:rPr>
-                <w:szCs w:val="20"/>
-              </w:rPr>
-              <w:t>kmph</w:t>
-            </w:r>
-            <w:proofErr w:type="spellEnd"/>
-            <w:r>
-              <w:rPr>
-                <w:szCs w:val="20"/>
-              </w:rPr>
-              <w:t>(</w:t>
-            </w:r>
-            <w:proofErr w:type="gramEnd"/>
-            <w:r>
-              <w:rPr>
-                <w:szCs w:val="20"/>
-              </w:rPr>
-              <w:t>42.2552)   # Miles-</w:t>
-            </w:r>
-            <w:proofErr w:type="spellStart"/>
-            <w:r>
-              <w:rPr>
-                <w:szCs w:val="20"/>
-              </w:rPr>
-              <w:t>Per_Hour</w:t>
-            </w:r>
-            <w:proofErr w:type="spellEnd"/>
-            <w:r>
-              <w:rPr>
-                <w:szCs w:val="20"/>
-              </w:rPr>
-              <w:t xml:space="preserve"> to Kilometers-</w:t>
-            </w:r>
-            <w:proofErr w:type="spellStart"/>
-            <w:r>
-              <w:rPr>
-                <w:szCs w:val="20"/>
-              </w:rPr>
-              <w:t>Per_Hour</w:t>
-            </w:r>
-            <w:proofErr w:type="spellEnd"/>
-            <w:r>
-              <w:rPr>
-                <w:szCs w:val="20"/>
-              </w:rPr>
-              <w:t xml:space="preserve"> Converter</w:t>
+              <w:t xml:space="preserve">  # Kilometers-Per_Hour to Miles-Per_Hour Converter</w:t>
+            </w:r>
+          </w:p>
+          <w:p>
+            <w:pPr>
+              <w:rPr>
+                <w:szCs w:val="20"/>
+              </w:rPr>
+            </w:pPr>
+            <w:r>
+              <w:rPr>
+                <w:szCs w:val="20"/>
+              </w:rPr>
+              <w:t>42.</w:t>
+            </w:r>
+            <w:r>
+              <w:rPr>
+                <w:szCs w:val="20"/>
+              </w:rPr>
+              <w:t>257</w:t>
+            </w:r>
+          </w:p>
+          <w:p>
+            <w:pPr>
+              <w:rPr>
+                <w:szCs w:val="20"/>
+              </w:rPr>
+            </w:pPr>
+          </w:p>
+          <w:p>
+            <w:pPr>
+              <w:rPr>
+                <w:szCs w:val="20"/>
+              </w:rPr>
+            </w:pPr>
+            <w:r>
+              <w:rPr>
+                <w:szCs w:val="20"/>
+              </w:rPr>
+              <w:t>&gt;&gt;&gt; mph_to_kmph(42.25</w:t>
+            </w:r>
+            <w:r>
+              <w:rPr>
+                <w:szCs w:val="20"/>
+              </w:rPr>
+              <w:t>7</w:t>
+            </w:r>
+            <w:r>
+              <w:rPr>
+                <w:szCs w:val="20"/>
+              </w:rPr>
+              <w:t xml:space="preserve">)  </w:t>
+            </w:r>
+            <w:r>
+              <w:rPr>
+                <w:szCs w:val="20"/>
+              </w:rPr>
+              <w:t xml:space="preserve">  </w:t>
+            </w:r>
+            <w:r>
+              <w:rPr>
+                <w:szCs w:val="20"/>
+              </w:rPr>
+              <w:t xml:space="preserve"> # Miles-Per_Hour to Kilometers-Per_Hour Converter</w:t>
             </w:r>
           </w:p>
           <w:p>
@@ -2528,35 +2063,7 @@
               <w:rPr>
                 <w:szCs w:val="20"/>
               </w:rPr>
-              <w:t xml:space="preserve">&gt;&gt;&gt; </w:t>
-            </w:r>
-            <w:proofErr w:type="spellStart"/>
-            <w:r>
-              <w:rPr>
-                <w:szCs w:val="20"/>
-              </w:rPr>
-              <w:t>knots_to_</w:t>
-            </w:r>
-            <w:proofErr w:type="gramStart"/>
-            <w:r>
-              <w:rPr>
-                <w:szCs w:val="20"/>
-              </w:rPr>
-              <w:t>kmph</w:t>
-            </w:r>
-            <w:proofErr w:type="spellEnd"/>
-            <w:r>
-              <w:rPr>
-                <w:szCs w:val="20"/>
-              </w:rPr>
-              <w:t>(</w:t>
-            </w:r>
-            <w:proofErr w:type="gramEnd"/>
-            <w:r>
-              <w:rPr>
-                <w:szCs w:val="20"/>
-              </w:rPr>
-              <w:t xml:space="preserve">22)     </w:t>
+              <w:t xml:space="preserve">&gt;&gt;&gt; knots_to_kmph(22)     </w:t>
             </w:r>
             <w:r>
               <w:rPr>
@@ -2581,55 +2088,45 @@
               <w:rPr>
                 <w:szCs w:val="20"/>
               </w:rPr>
-              <w:t>40.744</w:t>
-            </w:r>
-          </w:p>
-          <w:p>
-            <w:pPr>
-              <w:rPr>
-                <w:szCs w:val="20"/>
-              </w:rPr>
-            </w:pPr>
-          </w:p>
-          <w:p>
-            <w:pPr>
-              <w:rPr>
-                <w:szCs w:val="20"/>
-              </w:rPr>
-            </w:pPr>
-            <w:r>
-              <w:rPr>
-                <w:szCs w:val="20"/>
-              </w:rPr>
-              <w:t xml:space="preserve">&gt;&gt;&gt; </w:t>
-            </w:r>
-            <w:proofErr w:type="spellStart"/>
-            <w:r>
-              <w:rPr>
-                <w:szCs w:val="20"/>
-              </w:rPr>
-              <w:t>kmph_to_</w:t>
-            </w:r>
-            <w:proofErr w:type="gramStart"/>
-            <w:r>
-              <w:rPr>
-                <w:szCs w:val="20"/>
-              </w:rPr>
-              <w:t>knots</w:t>
-            </w:r>
-            <w:proofErr w:type="spellEnd"/>
-            <w:r>
-              <w:rPr>
-                <w:szCs w:val="20"/>
-              </w:rPr>
-              <w:t>(</w:t>
-            </w:r>
-            <w:proofErr w:type="gramEnd"/>
-            <w:r>
-              <w:rPr>
-                <w:szCs w:val="20"/>
-              </w:rPr>
-              <w:t xml:space="preserve">40.744) </w:t>
+              <w:t>40.74</w:t>
+            </w:r>
+            <w:r>
+              <w:rPr>
+                <w:szCs w:val="20"/>
+              </w:rPr>
+              <w:t>05</w:t>
+            </w:r>
+          </w:p>
+          <w:p>
+            <w:pPr>
+              <w:rPr>
+                <w:szCs w:val="20"/>
+              </w:rPr>
+            </w:pPr>
+          </w:p>
+          <w:p>
+            <w:pPr>
+              <w:rPr>
+                <w:szCs w:val="20"/>
+              </w:rPr>
+            </w:pPr>
+            <w:r>
+              <w:rPr>
+                <w:szCs w:val="20"/>
+              </w:rPr>
+              <w:t>&gt;&gt;&gt; kmph_to_knots(40.74</w:t>
+            </w:r>
+            <w:r>
+              <w:rPr>
+                <w:szCs w:val="20"/>
+              </w:rPr>
+              <w:t>05</w:t>
+            </w:r>
+            <w:r>
+              <w:rPr>
+                <w:szCs w:val="20"/>
+              </w:rPr>
+              <w:t xml:space="preserve">) </w:t>
             </w:r>
             <w:r>
               <w:rPr>
@@ -2674,35 +2171,7 @@
               <w:rPr>
                 <w:szCs w:val="20"/>
               </w:rPr>
-              <w:t xml:space="preserve">&gt;&gt;&gt; </w:t>
-            </w:r>
-            <w:proofErr w:type="spellStart"/>
-            <w:r>
-              <w:rPr>
-                <w:szCs w:val="20"/>
-              </w:rPr>
-              <w:t>knots_to_</w:t>
-            </w:r>
-            <w:proofErr w:type="gramStart"/>
-            <w:r>
-              <w:rPr>
-                <w:szCs w:val="20"/>
-              </w:rPr>
-              <w:t>mph</w:t>
-            </w:r>
-            <w:proofErr w:type="spellEnd"/>
-            <w:r>
-              <w:rPr>
-                <w:szCs w:val="20"/>
-              </w:rPr>
-              <w:t>(</w:t>
-            </w:r>
-            <w:proofErr w:type="gramEnd"/>
-            <w:r>
-              <w:rPr>
-                <w:szCs w:val="20"/>
-              </w:rPr>
-              <w:t xml:space="preserve">22)     </w:t>
+              <w:t xml:space="preserve">&gt;&gt;&gt; knots_to_mph(22)     </w:t>
             </w:r>
             <w:r>
               <w:rPr>
@@ -2727,7 +2196,13 @@
               <w:rPr>
                 <w:szCs w:val="20"/>
               </w:rPr>
-              <w:t>25.322</w:t>
+              <w:t>25.3</w:t>
+            </w:r>
+            <w:r>
+              <w:rPr>
+                <w:szCs w:val="20"/>
+              </w:rPr>
+              <w:t>172</w:t>
             </w:r>
             <w:r>
               <w:rPr>
@@ -2753,41 +2228,25 @@
               <w:rPr>
                 <w:szCs w:val="20"/>
               </w:rPr>
-              <w:t xml:space="preserve">&gt;&gt;&gt; </w:t>
-            </w:r>
-            <w:proofErr w:type="spellStart"/>
-            <w:r>
-              <w:rPr>
-                <w:szCs w:val="20"/>
-              </w:rPr>
-              <w:t>mph_to_</w:t>
-            </w:r>
-            <w:proofErr w:type="gramStart"/>
-            <w:r>
-              <w:rPr>
-                <w:szCs w:val="20"/>
-              </w:rPr>
-              <w:t>knots</w:t>
-            </w:r>
-            <w:proofErr w:type="spellEnd"/>
-            <w:r>
-              <w:rPr>
-                <w:szCs w:val="20"/>
-              </w:rPr>
-              <w:t>(</w:t>
-            </w:r>
-            <w:proofErr w:type="gramEnd"/>
-            <w:r>
-              <w:rPr>
-                <w:szCs w:val="20"/>
-              </w:rPr>
-              <w:t xml:space="preserve">25.322)  </w:t>
-            </w:r>
-            <w:r>
-              <w:rPr>
-                <w:szCs w:val="20"/>
-              </w:rPr>
-              <w:t xml:space="preserve">   </w:t>
+              <w:t>&gt;&gt;&gt; mph_to_knots(25.3</w:t>
+            </w:r>
+            <w:r>
+              <w:rPr>
+                <w:szCs w:val="20"/>
+              </w:rPr>
+              <w:t>172</w:t>
+            </w:r>
+            <w:r>
+              <w:rPr>
+                <w:szCs w:val="20"/>
+              </w:rPr>
+              <w:t xml:space="preserve">)  </w:t>
+            </w:r>
+            <w:r>
+              <w:rPr>
+                <w:szCs w:val="20"/>
+              </w:rPr>
+              <w:t xml:space="preserve">  </w:t>
             </w:r>
             <w:r>
               <w:rPr>
@@ -2895,7 +2354,6 @@
                 <w:lang w:val="en"/>
               </w:rPr>
             </w:pPr>
-            <w:proofErr w:type="spellStart"/>
             <w:r>
               <w:rPr>
                 <w:bCs/>
@@ -2914,28 +2372,23 @@
                 <w:color w:val="2E74B5" w:themeColor="accent5" w:themeShade="BF"/>
                 <w:lang w:val="en"/>
               </w:rPr>
-              <w:t>class</w:t>
-            </w:r>
-            <w:proofErr w:type="spellEnd"/>
-            <w:r>
-              <w:rPr>
-                <w:bCs/>
-                <w:i/>
+              <w:t xml:space="preserve">class </w:t>
+            </w:r>
+            <w:r>
+              <w:rPr>
+                <w:bCs/>
                 <w:iCs/>
-                <w:color w:val="2E74B5" w:themeColor="accent5" w:themeShade="BF"/>
-                <w:lang w:val="en"/>
-              </w:rPr>
-              <w:t xml:space="preserve"> </w:t>
-            </w:r>
-            <w:proofErr w:type="spellStart"/>
-            <w:proofErr w:type="gramStart"/>
+                <w:lang w:val="en"/>
+              </w:rPr>
+              <w:t>velocity.</w:t>
+            </w:r>
             <w:r>
               <w:rPr>
                 <w:bCs/>
                 <w:iCs/>
                 <w:lang w:val="en"/>
               </w:rPr>
-              <w:t>velocity.</w:t>
+              <w:t>velocity</w:t>
             </w:r>
             <w:r>
               <w:rPr>
@@ -2943,18 +2396,8 @@
                 <w:iCs/>
                 <w:lang w:val="en"/>
               </w:rPr>
-              <w:t>velocity</w:t>
-            </w:r>
-            <w:proofErr w:type="gramEnd"/>
-            <w:r>
-              <w:rPr>
-                <w:bCs/>
-                <w:iCs/>
-                <w:lang w:val="en"/>
-              </w:rPr>
               <w:t>_of_light</w:t>
             </w:r>
-            <w:proofErr w:type="spellEnd"/>
             <w:r>
               <w:rPr>
                 <w:bCs/>
@@ -3151,21 +2594,7 @@
               <w:rPr>
                 <w:szCs w:val="20"/>
               </w:rPr>
-              <w:t xml:space="preserve">&gt;&gt;&gt; from </w:t>
-            </w:r>
-            <w:proofErr w:type="spellStart"/>
-            <w:r>
-              <w:rPr>
-                <w:szCs w:val="20"/>
-              </w:rPr>
-              <w:t>cedargrove_unit_</w:t>
-            </w:r>
-            <w:proofErr w:type="gramStart"/>
-            <w:r>
-              <w:rPr>
-                <w:szCs w:val="20"/>
-              </w:rPr>
-              <w:t>converter.</w:t>
+              <w:t>&gt;&gt;&gt; from cedargrove_unit_converter.</w:t>
             </w:r>
             <w:r>
               <w:rPr>
@@ -3173,15 +2602,12 @@
               </w:rPr>
               <w:t>velocity</w:t>
             </w:r>
-            <w:proofErr w:type="spellEnd"/>
-            <w:proofErr w:type="gramEnd"/>
             <w:r>
               <w:rPr>
                 <w:szCs w:val="20"/>
               </w:rPr>
               <w:t xml:space="preserve"> import </w:t>
             </w:r>
-            <w:proofErr w:type="spellStart"/>
             <w:r>
               <w:rPr>
                 <w:szCs w:val="20"/>
@@ -3194,7 +2620,6 @@
               </w:rPr>
               <w:t>_of_light</w:t>
             </w:r>
-            <w:proofErr w:type="spellEnd"/>
           </w:p>
           <w:p>
             <w:pPr>
@@ -3208,7 +2633,6 @@
               </w:rPr>
               <w:t xml:space="preserve">&gt;&gt;&gt; </w:t>
             </w:r>
-            <w:proofErr w:type="spellStart"/>
             <w:r>
               <w:rPr>
                 <w:szCs w:val="20"/>
@@ -3219,28 +2643,7 @@
               <w:rPr>
                 <w:szCs w:val="20"/>
               </w:rPr>
-              <w:t>_of_</w:t>
-            </w:r>
-            <w:proofErr w:type="gramStart"/>
-            <w:r>
-              <w:rPr>
-                <w:szCs w:val="20"/>
-              </w:rPr>
-              <w:t>light</w:t>
-            </w:r>
-            <w:proofErr w:type="spellEnd"/>
-            <w:r>
-              <w:rPr>
-                <w:szCs w:val="20"/>
-              </w:rPr>
-              <w:t>(</w:t>
-            </w:r>
-            <w:proofErr w:type="gramEnd"/>
-            <w:r>
-              <w:rPr>
-                <w:szCs w:val="20"/>
-              </w:rPr>
-              <w:t>)</w:t>
+              <w:t>_of_light()</w:t>
             </w:r>
           </w:p>
           <w:p>
@@ -3316,7 +2719,6 @@
                 <w:lang w:val="en"/>
               </w:rPr>
             </w:pPr>
-            <w:proofErr w:type="spellStart"/>
             <w:r>
               <w:rPr>
                 <w:bCs/>
@@ -3335,30 +2737,24 @@
                 <w:color w:val="2E74B5" w:themeColor="accent5" w:themeShade="BF"/>
                 <w:lang w:val="en"/>
               </w:rPr>
-              <w:t>class</w:t>
-            </w:r>
-            <w:proofErr w:type="spellEnd"/>
-            <w:r>
-              <w:rPr>
-                <w:bCs/>
-                <w:i/>
+              <w:t xml:space="preserve">class </w:t>
+            </w:r>
+            <w:r>
+              <w:rPr>
+                <w:bCs/>
                 <w:iCs/>
-                <w:color w:val="2E74B5" w:themeColor="accent5" w:themeShade="BF"/>
-                <w:lang w:val="en"/>
-              </w:rPr>
-              <w:t xml:space="preserve"> </w:t>
-            </w:r>
-            <w:proofErr w:type="spellStart"/>
-            <w:proofErr w:type="gramStart"/>
+                <w:lang w:val="en"/>
+              </w:rPr>
+              <w:t>velocity.</w:t>
+            </w:r>
             <w:r>
               <w:rPr>
                 <w:bCs/>
                 <w:iCs/>
                 <w:lang w:val="en"/>
               </w:rPr>
-              <w:t>velocity.speed</w:t>
-            </w:r>
-            <w:proofErr w:type="gramEnd"/>
+              <w:t>velocity</w:t>
+            </w:r>
             <w:r>
               <w:rPr>
                 <w:bCs/>
@@ -3367,7 +2763,6 @@
               </w:rPr>
               <w:t>_of_sound</w:t>
             </w:r>
-            <w:proofErr w:type="spellEnd"/>
             <w:r>
               <w:rPr>
                 <w:bCs/>
@@ -3406,7 +2801,19 @@
         <w:rPr>
           <w:lang w:val="en"/>
         </w:rPr>
-        <w:t xml:space="preserve">Returns the constant value for the speed of sound in air, water, or steel. The value is in meters-per-second. </w:t>
+        <w:t>Returns the constant value for the speed of sound in air, water, or steel. The value</w:t>
+      </w:r>
+      <w:r>
+        <w:rPr>
+          <w:lang w:val="en"/>
+        </w:rPr>
+        <w:t xml:space="preserve"> returned</w:t>
+      </w:r>
+      <w:r>
+        <w:rPr>
+          <w:lang w:val="en"/>
+        </w:rPr>
+        <w:t xml:space="preserve"> is in meters-per-second. </w:t>
       </w:r>
     </w:p>
     <w:tbl>
@@ -3573,21 +2980,7 @@
               <w:rPr>
                 <w:szCs w:val="20"/>
               </w:rPr>
-              <w:t xml:space="preserve">&gt;&gt;&gt; from </w:t>
-            </w:r>
-            <w:proofErr w:type="spellStart"/>
-            <w:r>
-              <w:rPr>
-                <w:szCs w:val="20"/>
-              </w:rPr>
-              <w:t>cedargrove_unit_</w:t>
-            </w:r>
-            <w:proofErr w:type="gramStart"/>
-            <w:r>
-              <w:rPr>
-                <w:szCs w:val="20"/>
-              </w:rPr>
-              <w:t>converter.</w:t>
+              <w:t>&gt;&gt;&gt; from cedargrove_unit_converter.</w:t>
             </w:r>
             <w:r>
               <w:rPr>
@@ -3595,15 +2988,12 @@
               </w:rPr>
               <w:t>velocity</w:t>
             </w:r>
-            <w:proofErr w:type="spellEnd"/>
-            <w:proofErr w:type="gramEnd"/>
             <w:r>
               <w:rPr>
                 <w:szCs w:val="20"/>
               </w:rPr>
               <w:t xml:space="preserve"> import </w:t>
             </w:r>
-            <w:proofErr w:type="spellStart"/>
             <w:r>
               <w:rPr>
                 <w:szCs w:val="20"/>
@@ -3616,7 +3006,6 @@
               </w:rPr>
               <w:t>_of_sound</w:t>
             </w:r>
-            <w:proofErr w:type="spellEnd"/>
           </w:p>
           <w:p>
             <w:pPr>
@@ -3630,7 +3019,6 @@
               </w:rPr>
               <w:t xml:space="preserve">&gt;&gt;&gt; </w:t>
             </w:r>
-            <w:proofErr w:type="spellStart"/>
             <w:r>
               <w:rPr>
                 <w:szCs w:val="20"/>
@@ -3641,28 +3029,7 @@
               <w:rPr>
                 <w:szCs w:val="20"/>
               </w:rPr>
-              <w:t>_of_</w:t>
-            </w:r>
-            <w:proofErr w:type="gramStart"/>
-            <w:r>
-              <w:rPr>
-                <w:szCs w:val="20"/>
-              </w:rPr>
-              <w:t>sound</w:t>
-            </w:r>
-            <w:proofErr w:type="spellEnd"/>
-            <w:r>
-              <w:rPr>
-                <w:szCs w:val="20"/>
-              </w:rPr>
-              <w:t>(</w:t>
-            </w:r>
-            <w:proofErr w:type="gramEnd"/>
-            <w:r>
-              <w:rPr>
-                <w:szCs w:val="20"/>
-              </w:rPr>
-              <w:t>)</w:t>
+              <w:t>_of_sound()</w:t>
             </w:r>
           </w:p>
           <w:p>
@@ -3697,7 +3064,6 @@
               </w:rPr>
               <w:t xml:space="preserve">&gt;&gt;&gt; </w:t>
             </w:r>
-            <w:proofErr w:type="spellStart"/>
             <w:r>
               <w:rPr>
                 <w:szCs w:val="20"/>
@@ -3708,28 +3074,7 @@
               <w:rPr>
                 <w:szCs w:val="20"/>
               </w:rPr>
-              <w:t>_of_sound</w:t>
-            </w:r>
-            <w:proofErr w:type="spellEnd"/>
-            <w:r>
-              <w:rPr>
-                <w:szCs w:val="20"/>
-              </w:rPr>
-              <w:t>(medium</w:t>
-            </w:r>
-            <w:proofErr w:type="gramStart"/>
-            <w:r>
-              <w:rPr>
-                <w:szCs w:val="20"/>
-              </w:rPr>
-              <w:t>=”air</w:t>
-            </w:r>
-            <w:proofErr w:type="gramEnd"/>
-            <w:r>
-              <w:rPr>
-                <w:szCs w:val="20"/>
-              </w:rPr>
-              <w:t>”)</w:t>
+              <w:t>_of_sound(medium=”air”)</w:t>
             </w:r>
           </w:p>
           <w:p>
@@ -3764,7 +3109,6 @@
               </w:rPr>
               <w:t xml:space="preserve">&gt;&gt;&gt; </w:t>
             </w:r>
-            <w:proofErr w:type="spellStart"/>
             <w:r>
               <w:rPr>
                 <w:szCs w:val="20"/>
@@ -3775,28 +3119,7 @@
               <w:rPr>
                 <w:szCs w:val="20"/>
               </w:rPr>
-              <w:t>_of_sound</w:t>
-            </w:r>
-            <w:proofErr w:type="spellEnd"/>
-            <w:r>
-              <w:rPr>
-                <w:szCs w:val="20"/>
-              </w:rPr>
-              <w:t>(medium</w:t>
-            </w:r>
-            <w:proofErr w:type="gramStart"/>
-            <w:r>
-              <w:rPr>
-                <w:szCs w:val="20"/>
-              </w:rPr>
-              <w:t>=”water</w:t>
-            </w:r>
-            <w:proofErr w:type="gramEnd"/>
-            <w:r>
-              <w:rPr>
-                <w:szCs w:val="20"/>
-              </w:rPr>
-              <w:t>”)</w:t>
+              <w:t>_of_sound(medium=”water”)</w:t>
             </w:r>
           </w:p>
           <w:p>
@@ -3831,7 +3154,6 @@
               </w:rPr>
               <w:t xml:space="preserve">&gt;&gt;&gt; </w:t>
             </w:r>
-            <w:proofErr w:type="spellStart"/>
             <w:r>
               <w:rPr>
                 <w:szCs w:val="20"/>
@@ -3842,28 +3164,7 @@
               <w:rPr>
                 <w:szCs w:val="20"/>
               </w:rPr>
-              <w:t>_of_sound</w:t>
-            </w:r>
-            <w:proofErr w:type="spellEnd"/>
-            <w:r>
-              <w:rPr>
-                <w:szCs w:val="20"/>
-              </w:rPr>
-              <w:t>(medium</w:t>
-            </w:r>
-            <w:proofErr w:type="gramStart"/>
-            <w:r>
-              <w:rPr>
-                <w:szCs w:val="20"/>
-              </w:rPr>
-              <w:t>=”steel</w:t>
-            </w:r>
-            <w:proofErr w:type="gramEnd"/>
-            <w:r>
-              <w:rPr>
-                <w:szCs w:val="20"/>
-              </w:rPr>
-              <w:t>”)</w:t>
+              <w:t>_of_sound(medium=”steel”)</w:t>
             </w:r>
           </w:p>
           <w:p>

</xml_diff>